<commit_message>
cuaderno de bitacora v1.1
</commit_message>
<xml_diff>
--- a/Cuaderno de bitácora/Cuaderno_de_bitacora_v1.0_2026-10-03.docx
+++ b/Cuaderno de bitácora/Cuaderno_de_bitacora_v1.0_2026-10-03.docx
@@ -66,12 +66,21 @@
                 <w:szCs w:val="19"/>
               </w:rPr>
             </w:pPr>
-            <w:r>
-              <w:rPr>
-                <w:sz w:val="19"/>
-                <w:szCs w:val="19"/>
-              </w:rPr>
-              <w:t>TuSuper en línea</w:t>
+            <w:proofErr w:type="spellStart"/>
+            <w:r>
+              <w:rPr>
+                <w:sz w:val="19"/>
+                <w:szCs w:val="19"/>
+              </w:rPr>
+              <w:t>TuSuper</w:t>
+            </w:r>
+            <w:proofErr w:type="spellEnd"/>
+            <w:r>
+              <w:rPr>
+                <w:sz w:val="19"/>
+                <w:szCs w:val="19"/>
+              </w:rPr>
+              <w:t xml:space="preserve"> en línea</w:t>
             </w:r>
           </w:p>
         </w:tc>
@@ -641,6 +650,13 @@
                 <w:szCs w:val="19"/>
               </w:rPr>
             </w:pPr>
+            <w:r>
+              <w:rPr>
+                <w:sz w:val="19"/>
+                <w:szCs w:val="19"/>
+              </w:rPr>
+              <w:t>v1.1</w:t>
+            </w:r>
           </w:p>
         </w:tc>
         <w:tc>
@@ -654,6 +670,13 @@
                 <w:szCs w:val="19"/>
               </w:rPr>
             </w:pPr>
+            <w:r>
+              <w:rPr>
+                <w:sz w:val="19"/>
+                <w:szCs w:val="19"/>
+              </w:rPr>
+              <w:t>14/10/2026</w:t>
+            </w:r>
           </w:p>
         </w:tc>
         <w:tc>
@@ -667,6 +690,13 @@
                 <w:szCs w:val="19"/>
               </w:rPr>
             </w:pPr>
+            <w:r>
+              <w:rPr>
+                <w:sz w:val="19"/>
+                <w:szCs w:val="19"/>
+              </w:rPr>
+              <w:t>CRMV</w:t>
+            </w:r>
           </w:p>
         </w:tc>
         <w:tc>
@@ -680,6 +710,20 @@
                 <w:szCs w:val="19"/>
               </w:rPr>
             </w:pPr>
+            <w:r>
+              <w:rPr>
+                <w:sz w:val="19"/>
+                <w:szCs w:val="19"/>
+              </w:rPr>
+              <w:t xml:space="preserve">Adición de la tercera reunión y de las tareas asignadas en dicha reunión, </w:t>
+            </w:r>
+            <w:r>
+              <w:rPr>
+                <w:sz w:val="19"/>
+                <w:szCs w:val="19"/>
+              </w:rPr>
+              <w:t>adición de la consulta 01 realizada al patrocinador</w:t>
+            </w:r>
           </w:p>
         </w:tc>
       </w:tr>
@@ -950,7 +994,23 @@
                 <w:sz w:val="18"/>
                 <w:szCs w:val="18"/>
               </w:rPr>
-              <w:t>El nombre del documento ya está puesto y solo hay que cambiar vX.Y por la versión. La primera que se sube a la carpeta del proyecto es la v1.0, y cada versión con cambios aumenta el segundo número (v1.1, v1.2…), como fija el plan de configuración genérico de la consultora (TC-OP-CFG, apartado 4). La versión que figura en el nombre de esta plantilla es la de la plantilla y no cuenta.</w:t>
+              <w:t xml:space="preserve">El nombre del documento ya está puesto y solo hay que cambiar </w:t>
+            </w:r>
+            <w:proofErr w:type="spellStart"/>
+            <w:r>
+              <w:rPr>
+                <w:sz w:val="18"/>
+                <w:szCs w:val="18"/>
+              </w:rPr>
+              <w:t>vX.Y</w:t>
+            </w:r>
+            <w:proofErr w:type="spellEnd"/>
+            <w:r>
+              <w:rPr>
+                <w:sz w:val="18"/>
+                <w:szCs w:val="18"/>
+              </w:rPr>
+              <w:t xml:space="preserve"> por la versión. La primera que se sube a la carpeta del proyecto es la v1.0, y cada versión con cambios aumenta el segundo número (v1.1, v1.2…), como fija el plan de configuración genérico de la consultora (TC-OP-CFG, apartado 4). La versión que figura en el nombre de esta plantilla es la de la plantilla y no cuenta.</w:t>
             </w:r>
           </w:p>
         </w:tc>
@@ -999,7 +1059,39 @@
                 <w:sz w:val="18"/>
                 <w:szCs w:val="18"/>
               </w:rPr>
-              <w:t>El día en que se cierra esta versión (dd/mm/aaaa). Aquí no se usan semanas del proyecto.</w:t>
+              <w:t>El día en que se cierra esta versión (</w:t>
+            </w:r>
+            <w:proofErr w:type="spellStart"/>
+            <w:r>
+              <w:rPr>
+                <w:sz w:val="18"/>
+                <w:szCs w:val="18"/>
+              </w:rPr>
+              <w:t>dd</w:t>
+            </w:r>
+            <w:proofErr w:type="spellEnd"/>
+            <w:r>
+              <w:rPr>
+                <w:sz w:val="18"/>
+                <w:szCs w:val="18"/>
+              </w:rPr>
+              <w:t>/mm/</w:t>
+            </w:r>
+            <w:proofErr w:type="spellStart"/>
+            <w:r>
+              <w:rPr>
+                <w:sz w:val="18"/>
+                <w:szCs w:val="18"/>
+              </w:rPr>
+              <w:t>aaaa</w:t>
+            </w:r>
+            <w:proofErr w:type="spellEnd"/>
+            <w:r>
+              <w:rPr>
+                <w:sz w:val="18"/>
+                <w:szCs w:val="18"/>
+              </w:rPr>
+              <w:t>). Aquí no se usan semanas del proyecto.</w:t>
             </w:r>
           </w:p>
         </w:tc>
@@ -1263,7 +1355,23 @@
                 <w:sz w:val="18"/>
                 <w:szCs w:val="18"/>
               </w:rPr>
-              <w:t>Cada anotación se hace el día en que ocurre lo que cuenta, porque una decisión solo acredita cómo razonó el grupo si quedó escrita antes de conocer sus consecuencias. La decisión que se revoca y la estimación que resultó mala no se borran: se quedan donde estaban y la rectificación se anota aparte, con su fecha.</w:t>
+              <w:t xml:space="preserve">Cada anotación se hace el día en que ocurre lo que cuenta, porque una decisión solo acredita cómo razonó el grupo si quedó escrita antes de conocer sus consecuencias. La decisión que se revoca y la estimación que resultó mala no se borran: se quedan </w:t>
+            </w:r>
+            <w:proofErr w:type="spellStart"/>
+            <w:r>
+              <w:rPr>
+                <w:sz w:val="18"/>
+                <w:szCs w:val="18"/>
+              </w:rPr>
+              <w:t>donde</w:t>
+            </w:r>
+            <w:proofErr w:type="spellEnd"/>
+            <w:r>
+              <w:rPr>
+                <w:sz w:val="18"/>
+                <w:szCs w:val="18"/>
+              </w:rPr>
+              <w:t xml:space="preserve"> estaban y la rectificación se anota aparte, con su fecha.</w:t>
             </w:r>
           </w:p>
         </w:tc>
@@ -1418,7 +1526,39 @@
                 <w:sz w:val="18"/>
                 <w:szCs w:val="18"/>
               </w:rPr>
-              <w:t>Día de la reunión, dd/mm/aaaa.</w:t>
+              <w:t xml:space="preserve">Día de la reunión, </w:t>
+            </w:r>
+            <w:proofErr w:type="spellStart"/>
+            <w:r>
+              <w:rPr>
+                <w:sz w:val="18"/>
+                <w:szCs w:val="18"/>
+              </w:rPr>
+              <w:t>dd</w:t>
+            </w:r>
+            <w:proofErr w:type="spellEnd"/>
+            <w:r>
+              <w:rPr>
+                <w:sz w:val="18"/>
+                <w:szCs w:val="18"/>
+              </w:rPr>
+              <w:t>/mm/</w:t>
+            </w:r>
+            <w:proofErr w:type="spellStart"/>
+            <w:r>
+              <w:rPr>
+                <w:sz w:val="18"/>
+                <w:szCs w:val="18"/>
+              </w:rPr>
+              <w:t>aaaa</w:t>
+            </w:r>
+            <w:proofErr w:type="spellEnd"/>
+            <w:r>
+              <w:rPr>
+                <w:sz w:val="18"/>
+                <w:szCs w:val="18"/>
+              </w:rPr>
+              <w:t>.</w:t>
             </w:r>
           </w:p>
         </w:tc>
@@ -1918,7 +2058,23 @@
                 <w:sz w:val="17"/>
                 <w:szCs w:val="17"/>
               </w:rPr>
-              <w:t>Primera sesión de laboratorio (Práctica 01): inicio del proyecto TuSuper en línea y propuesta de Daniel Salado Hidalgo como director del proyecto (D-01).</w:t>
+              <w:t xml:space="preserve">Primera sesión de laboratorio (Práctica 01): inicio del proyecto </w:t>
+            </w:r>
+            <w:proofErr w:type="spellStart"/>
+            <w:r>
+              <w:rPr>
+                <w:sz w:val="17"/>
+                <w:szCs w:val="17"/>
+              </w:rPr>
+              <w:t>TuSuper</w:t>
+            </w:r>
+            <w:proofErr w:type="spellEnd"/>
+            <w:r>
+              <w:rPr>
+                <w:sz w:val="17"/>
+                <w:szCs w:val="17"/>
+              </w:rPr>
+              <w:t xml:space="preserve"> en línea y propuesta de Daniel Salado Hidalgo como director del proyecto (D-01).</w:t>
             </w:r>
           </w:p>
         </w:tc>
@@ -2875,7 +3031,23 @@
                 <w:sz w:val="18"/>
                 <w:szCs w:val="18"/>
               </w:rPr>
-              <w:t>Un acta por cada reunión del registro, de media página como máximo, numerada de corrido. Para abrir la siguiente se copia el último bloque “ACTA Nº” junto con la línea en blanco que lo sigue y se pega detrás, antes del apartado 3; sin esa línea, Word une las dos tablas.</w:t>
+              <w:t xml:space="preserve">Un acta por cada reunión del registro, de media página como máximo, numerada de corrido. Para abrir la siguiente se copia el último bloque “ACTA </w:t>
+            </w:r>
+            <w:proofErr w:type="spellStart"/>
+            <w:r>
+              <w:rPr>
+                <w:sz w:val="18"/>
+                <w:szCs w:val="18"/>
+              </w:rPr>
+              <w:t>Nº</w:t>
+            </w:r>
+            <w:proofErr w:type="spellEnd"/>
+            <w:r>
+              <w:rPr>
+                <w:sz w:val="18"/>
+                <w:szCs w:val="18"/>
+              </w:rPr>
+              <w:t>” junto con la línea en blanco que lo sigue y se pega detrás, antes del apartado 3; sin esa línea, Word une las dos tablas.</w:t>
             </w:r>
           </w:p>
         </w:tc>
@@ -2903,8 +3075,19 @@
                 <w:sz w:val="18"/>
                 <w:szCs w:val="18"/>
               </w:rPr>
-              <w:t>ACTA Nº</w:t>
-            </w:r>
+              <w:t xml:space="preserve">ACTA </w:t>
+            </w:r>
+            <w:proofErr w:type="spellStart"/>
+            <w:r>
+              <w:rPr>
+                <w:b/>
+                <w:color w:val="1F4E5A"/>
+                <w:sz w:val="18"/>
+                <w:szCs w:val="18"/>
+              </w:rPr>
+              <w:t>Nº</w:t>
+            </w:r>
+            <w:proofErr w:type="spellEnd"/>
           </w:p>
         </w:tc>
         <w:tc>
@@ -3328,8 +3511,19 @@
                 <w:sz w:val="19"/>
                 <w:szCs w:val="19"/>
               </w:rPr>
-              <w:t>ACTA Nº</w:t>
-            </w:r>
+              <w:t xml:space="preserve">ACTA </w:t>
+            </w:r>
+            <w:proofErr w:type="spellStart"/>
+            <w:r>
+              <w:rPr>
+                <w:b/>
+                <w:color w:val="1F4E5A"/>
+                <w:sz w:val="19"/>
+                <w:szCs w:val="19"/>
+              </w:rPr>
+              <w:t>Nº</w:t>
+            </w:r>
+            <w:proofErr w:type="spellEnd"/>
           </w:p>
         </w:tc>
         <w:tc>
@@ -3553,7 +3747,23 @@
                 <w:sz w:val="17"/>
                 <w:szCs w:val="17"/>
               </w:rPr>
-              <w:t>Inicio del proyecto TuSuper en línea (TSL-2627) y propuesta de director del proyecto.</w:t>
+              <w:t xml:space="preserve">Inicio del proyecto </w:t>
+            </w:r>
+            <w:proofErr w:type="spellStart"/>
+            <w:r>
+              <w:rPr>
+                <w:sz w:val="17"/>
+                <w:szCs w:val="17"/>
+              </w:rPr>
+              <w:t>TuSuper</w:t>
+            </w:r>
+            <w:proofErr w:type="spellEnd"/>
+            <w:r>
+              <w:rPr>
+                <w:sz w:val="17"/>
+                <w:szCs w:val="17"/>
+              </w:rPr>
+              <w:t xml:space="preserve"> en línea (TSL-2627) y propuesta de director del proyecto.</w:t>
             </w:r>
           </w:p>
         </w:tc>
@@ -4217,8 +4427,19 @@
                 <w:szCs w:val="19"/>
               </w:rPr>
               <w:lastRenderedPageBreak/>
-              <w:t>ACTA Nº</w:t>
-            </w:r>
+              <w:t xml:space="preserve">ACTA </w:t>
+            </w:r>
+            <w:proofErr w:type="spellStart"/>
+            <w:r>
+              <w:rPr>
+                <w:b/>
+                <w:color w:val="1F4E5A"/>
+                <w:sz w:val="19"/>
+                <w:szCs w:val="19"/>
+              </w:rPr>
+              <w:t>Nº</w:t>
+            </w:r>
+            <w:proofErr w:type="spellEnd"/>
           </w:p>
         </w:tc>
         <w:tc>
@@ -4840,6 +5061,892 @@
                 <w:szCs w:val="19"/>
               </w:rPr>
             </w:pPr>
+          </w:p>
+        </w:tc>
+      </w:tr>
+      <w:tr>
+        <w:trPr>
+          <w:cantSplit/>
+          <w:trHeight w:val="567"/>
+        </w:trPr>
+        <w:tc>
+          <w:tcPr>
+            <w:tcW w:w="2607" w:type="dxa"/>
+            <w:shd w:val="clear" w:color="auto" w:fill="DCE6E8"/>
+            <w:vAlign w:val="center"/>
+          </w:tcPr>
+          <w:p>
+            <w:pPr>
+              <w:rPr>
+                <w:sz w:val="19"/>
+                <w:szCs w:val="19"/>
+              </w:rPr>
+            </w:pPr>
+            <w:r>
+              <w:rPr>
+                <w:b/>
+                <w:color w:val="1F4E5A"/>
+                <w:sz w:val="19"/>
+                <w:szCs w:val="19"/>
+              </w:rPr>
+              <w:t>PUNTO SIGUIENTE</w:t>
+            </w:r>
+          </w:p>
+        </w:tc>
+        <w:tc>
+          <w:tcPr>
+            <w:tcW w:w="11963" w:type="dxa"/>
+            <w:gridSpan w:val="3"/>
+          </w:tcPr>
+          <w:p>
+            <w:pPr>
+              <w:rPr>
+                <w:sz w:val="19"/>
+                <w:szCs w:val="19"/>
+              </w:rPr>
+            </w:pPr>
+            <w:r>
+              <w:rPr>
+                <w:sz w:val="17"/>
+                <w:szCs w:val="17"/>
+              </w:rPr>
+              <w:t>Reunión del 07/10/2026 (Práctica 02), con las entregas de esa sesión.</w:t>
+            </w:r>
+          </w:p>
+        </w:tc>
+      </w:tr>
+    </w:tbl>
+    <w:p>
+      <w:pPr>
+        <w:spacing w:after="0"/>
+        <w:rPr>
+          <w:sz w:val="12"/>
+          <w:szCs w:val="12"/>
+        </w:rPr>
+      </w:pPr>
+    </w:p>
+    <w:tbl>
+      <w:tblPr>
+        <w:tblStyle w:val="Tablaconcuadrcula"/>
+        <w:tblW w:w="14570" w:type="dxa"/>
+        <w:tblBorders>
+          <w:top w:val="single" w:sz="4" w:space="0" w:color="BFBFBF"/>
+          <w:left w:val="single" w:sz="4" w:space="0" w:color="BFBFBF"/>
+          <w:bottom w:val="single" w:sz="4" w:space="0" w:color="BFBFBF"/>
+          <w:right w:val="single" w:sz="4" w:space="0" w:color="BFBFBF"/>
+          <w:insideH w:val="single" w:sz="4" w:space="0" w:color="BFBFBF"/>
+          <w:insideV w:val="single" w:sz="4" w:space="0" w:color="BFBFBF"/>
+        </w:tblBorders>
+        <w:tblLayout w:type="fixed"/>
+        <w:tblLook w:val="04A0" w:firstRow="1" w:lastRow="0" w:firstColumn="1" w:lastColumn="0" w:noHBand="0" w:noVBand="1"/>
+      </w:tblPr>
+      <w:tblGrid>
+        <w:gridCol w:w="2607"/>
+        <w:gridCol w:w="6859"/>
+        <w:gridCol w:w="2551"/>
+        <w:gridCol w:w="2553"/>
+      </w:tblGrid>
+      <w:tr>
+        <w:trPr>
+          <w:cantSplit/>
+          <w:trHeight w:val="397"/>
+        </w:trPr>
+        <w:tc>
+          <w:tcPr>
+            <w:tcW w:w="2607" w:type="dxa"/>
+            <w:shd w:val="clear" w:color="auto" w:fill="DCE6E8"/>
+            <w:vAlign w:val="center"/>
+          </w:tcPr>
+          <w:p>
+            <w:pPr>
+              <w:keepNext/>
+              <w:rPr>
+                <w:sz w:val="19"/>
+                <w:szCs w:val="19"/>
+              </w:rPr>
+            </w:pPr>
+            <w:r>
+              <w:rPr>
+                <w:b/>
+                <w:color w:val="1F4E5A"/>
+                <w:sz w:val="19"/>
+                <w:szCs w:val="19"/>
+              </w:rPr>
+              <w:lastRenderedPageBreak/>
+              <w:t xml:space="preserve">ACTA </w:t>
+            </w:r>
+            <w:proofErr w:type="spellStart"/>
+            <w:r>
+              <w:rPr>
+                <w:b/>
+                <w:color w:val="1F4E5A"/>
+                <w:sz w:val="19"/>
+                <w:szCs w:val="19"/>
+              </w:rPr>
+              <w:t>Nº</w:t>
+            </w:r>
+            <w:proofErr w:type="spellEnd"/>
+          </w:p>
+        </w:tc>
+        <w:tc>
+          <w:tcPr>
+            <w:tcW w:w="11963" w:type="dxa"/>
+            <w:gridSpan w:val="3"/>
+          </w:tcPr>
+          <w:p>
+            <w:pPr>
+              <w:keepNext/>
+              <w:rPr>
+                <w:sz w:val="19"/>
+                <w:szCs w:val="19"/>
+              </w:rPr>
+            </w:pPr>
+            <w:r>
+              <w:rPr>
+                <w:sz w:val="17"/>
+                <w:szCs w:val="17"/>
+              </w:rPr>
+              <w:t>3</w:t>
+            </w:r>
+          </w:p>
+        </w:tc>
+      </w:tr>
+      <w:tr>
+        <w:trPr>
+          <w:cantSplit/>
+          <w:trHeight w:val="397"/>
+        </w:trPr>
+        <w:tc>
+          <w:tcPr>
+            <w:tcW w:w="2607" w:type="dxa"/>
+            <w:shd w:val="clear" w:color="auto" w:fill="DCE6E8"/>
+            <w:vAlign w:val="center"/>
+          </w:tcPr>
+          <w:p>
+            <w:pPr>
+              <w:keepNext/>
+              <w:rPr>
+                <w:sz w:val="19"/>
+                <w:szCs w:val="19"/>
+              </w:rPr>
+            </w:pPr>
+            <w:r>
+              <w:rPr>
+                <w:b/>
+                <w:color w:val="1F4E5A"/>
+                <w:sz w:val="19"/>
+                <w:szCs w:val="19"/>
+              </w:rPr>
+              <w:t>FECHA Y REUNIÓN</w:t>
+            </w:r>
+          </w:p>
+        </w:tc>
+        <w:tc>
+          <w:tcPr>
+            <w:tcW w:w="11963" w:type="dxa"/>
+            <w:gridSpan w:val="3"/>
+          </w:tcPr>
+          <w:p>
+            <w:pPr>
+              <w:keepNext/>
+              <w:rPr>
+                <w:sz w:val="19"/>
+                <w:szCs w:val="19"/>
+              </w:rPr>
+            </w:pPr>
+            <w:r>
+              <w:rPr>
+                <w:sz w:val="17"/>
+                <w:szCs w:val="17"/>
+              </w:rPr>
+              <w:t>08</w:t>
+            </w:r>
+            <w:r>
+              <w:rPr>
+                <w:sz w:val="17"/>
+                <w:szCs w:val="17"/>
+              </w:rPr>
+              <w:t>/10/2026 · Reunión extraordinaria (WhatsApp)</w:t>
+            </w:r>
+          </w:p>
+        </w:tc>
+      </w:tr>
+      <w:tr>
+        <w:trPr>
+          <w:cantSplit/>
+          <w:trHeight w:val="397"/>
+        </w:trPr>
+        <w:tc>
+          <w:tcPr>
+            <w:tcW w:w="2607" w:type="dxa"/>
+            <w:shd w:val="clear" w:color="auto" w:fill="DCE6E8"/>
+            <w:vAlign w:val="center"/>
+          </w:tcPr>
+          <w:p>
+            <w:pPr>
+              <w:keepNext/>
+              <w:rPr>
+                <w:sz w:val="19"/>
+                <w:szCs w:val="19"/>
+              </w:rPr>
+            </w:pPr>
+            <w:r>
+              <w:rPr>
+                <w:b/>
+                <w:color w:val="1F4E5A"/>
+                <w:sz w:val="19"/>
+                <w:szCs w:val="19"/>
+              </w:rPr>
+              <w:t>ASISTENTES</w:t>
+            </w:r>
+          </w:p>
+        </w:tc>
+        <w:tc>
+          <w:tcPr>
+            <w:tcW w:w="11963" w:type="dxa"/>
+            <w:gridSpan w:val="3"/>
+          </w:tcPr>
+          <w:p>
+            <w:pPr>
+              <w:keepNext/>
+              <w:rPr>
+                <w:sz w:val="19"/>
+                <w:szCs w:val="19"/>
+              </w:rPr>
+            </w:pPr>
+            <w:r>
+              <w:rPr>
+                <w:sz w:val="17"/>
+                <w:szCs w:val="17"/>
+              </w:rPr>
+              <w:t>FPJ, DSH, CVP</w:t>
+            </w:r>
+            <w:r>
+              <w:rPr>
+                <w:sz w:val="17"/>
+                <w:szCs w:val="17"/>
+              </w:rPr>
+              <w:t>, CRMV, EMA</w:t>
+            </w:r>
+          </w:p>
+        </w:tc>
+      </w:tr>
+      <w:tr>
+        <w:trPr>
+          <w:cantSplit/>
+          <w:trHeight w:val="397"/>
+        </w:trPr>
+        <w:tc>
+          <w:tcPr>
+            <w:tcW w:w="2607" w:type="dxa"/>
+            <w:shd w:val="clear" w:color="auto" w:fill="DCE6E8"/>
+            <w:vAlign w:val="center"/>
+          </w:tcPr>
+          <w:p>
+            <w:pPr>
+              <w:keepNext/>
+              <w:rPr>
+                <w:sz w:val="19"/>
+                <w:szCs w:val="19"/>
+              </w:rPr>
+            </w:pPr>
+            <w:r>
+              <w:rPr>
+                <w:b/>
+                <w:color w:val="1F4E5A"/>
+                <w:sz w:val="19"/>
+                <w:szCs w:val="19"/>
+              </w:rPr>
+              <w:t>AUSENCIAS</w:t>
+            </w:r>
+          </w:p>
+        </w:tc>
+        <w:tc>
+          <w:tcPr>
+            <w:tcW w:w="11963" w:type="dxa"/>
+            <w:gridSpan w:val="3"/>
+          </w:tcPr>
+          <w:p>
+            <w:pPr>
+              <w:keepNext/>
+              <w:rPr>
+                <w:sz w:val="19"/>
+                <w:szCs w:val="19"/>
+              </w:rPr>
+            </w:pPr>
+            <w:r>
+              <w:rPr>
+                <w:sz w:val="17"/>
+                <w:szCs w:val="17"/>
+              </w:rPr>
+              <w:t>Ninguna</w:t>
+            </w:r>
+          </w:p>
+        </w:tc>
+      </w:tr>
+      <w:tr>
+        <w:trPr>
+          <w:cantSplit/>
+          <w:trHeight w:val="907"/>
+        </w:trPr>
+        <w:tc>
+          <w:tcPr>
+            <w:tcW w:w="2607" w:type="dxa"/>
+            <w:shd w:val="clear" w:color="auto" w:fill="DCE6E8"/>
+            <w:vAlign w:val="center"/>
+          </w:tcPr>
+          <w:p>
+            <w:pPr>
+              <w:keepNext/>
+              <w:rPr>
+                <w:sz w:val="19"/>
+                <w:szCs w:val="19"/>
+              </w:rPr>
+            </w:pPr>
+            <w:r>
+              <w:rPr>
+                <w:b/>
+                <w:color w:val="1F4E5A"/>
+                <w:sz w:val="19"/>
+                <w:szCs w:val="19"/>
+              </w:rPr>
+              <w:t>ORDEN DEL DÍA</w:t>
+            </w:r>
+          </w:p>
+        </w:tc>
+        <w:tc>
+          <w:tcPr>
+            <w:tcW w:w="11963" w:type="dxa"/>
+            <w:gridSpan w:val="3"/>
+          </w:tcPr>
+          <w:p>
+            <w:pPr>
+              <w:keepNext/>
+              <w:rPr>
+                <w:sz w:val="19"/>
+                <w:szCs w:val="19"/>
+              </w:rPr>
+            </w:pPr>
+            <w:r>
+              <w:rPr>
+                <w:sz w:val="17"/>
+                <w:szCs w:val="17"/>
+              </w:rPr>
+              <w:t xml:space="preserve">Repartir el trabajo de la semana a </w:t>
+            </w:r>
+            <w:r>
+              <w:rPr>
+                <w:sz w:val="17"/>
+                <w:szCs w:val="17"/>
+              </w:rPr>
+              <w:t>cada miembro del grupo</w:t>
+            </w:r>
+          </w:p>
+        </w:tc>
+      </w:tr>
+      <w:tr>
+        <w:trPr>
+          <w:cantSplit/>
+          <w:trHeight w:val="397"/>
+        </w:trPr>
+        <w:tc>
+          <w:tcPr>
+            <w:tcW w:w="2607" w:type="dxa"/>
+            <w:shd w:val="clear" w:color="auto" w:fill="DCE6E8"/>
+            <w:vAlign w:val="center"/>
+          </w:tcPr>
+          <w:p>
+            <w:pPr>
+              <w:keepNext/>
+              <w:rPr>
+                <w:sz w:val="19"/>
+                <w:szCs w:val="19"/>
+              </w:rPr>
+            </w:pPr>
+            <w:r>
+              <w:rPr>
+                <w:b/>
+                <w:color w:val="1F4E5A"/>
+                <w:sz w:val="19"/>
+                <w:szCs w:val="19"/>
+              </w:rPr>
+              <w:t>DECISIONES TOMADAS</w:t>
+            </w:r>
+          </w:p>
+        </w:tc>
+        <w:tc>
+          <w:tcPr>
+            <w:tcW w:w="11963" w:type="dxa"/>
+            <w:gridSpan w:val="3"/>
+          </w:tcPr>
+          <w:p>
+            <w:pPr>
+              <w:keepNext/>
+              <w:rPr>
+                <w:sz w:val="19"/>
+                <w:szCs w:val="19"/>
+              </w:rPr>
+            </w:pPr>
+            <w:r>
+              <w:rPr>
+                <w:sz w:val="17"/>
+                <w:szCs w:val="17"/>
+              </w:rPr>
+              <w:t>Ninguna</w:t>
+            </w:r>
+          </w:p>
+        </w:tc>
+      </w:tr>
+      <w:tr>
+        <w:trPr>
+          <w:cantSplit/>
+        </w:trPr>
+        <w:tc>
+          <w:tcPr>
+            <w:tcW w:w="2607" w:type="dxa"/>
+            <w:vMerge w:val="restart"/>
+            <w:shd w:val="clear" w:color="auto" w:fill="DCE6E8"/>
+            <w:vAlign w:val="center"/>
+          </w:tcPr>
+          <w:p>
+            <w:pPr>
+              <w:keepNext/>
+              <w:rPr>
+                <w:sz w:val="19"/>
+                <w:szCs w:val="19"/>
+              </w:rPr>
+            </w:pPr>
+            <w:r>
+              <w:rPr>
+                <w:b/>
+                <w:color w:val="1F4E5A"/>
+                <w:sz w:val="19"/>
+                <w:szCs w:val="19"/>
+              </w:rPr>
+              <w:t>TAREAS ASIGNADAS</w:t>
+            </w:r>
+          </w:p>
+        </w:tc>
+        <w:tc>
+          <w:tcPr>
+            <w:tcW w:w="6859" w:type="dxa"/>
+            <w:shd w:val="clear" w:color="auto" w:fill="DCE6E8"/>
+          </w:tcPr>
+          <w:p>
+            <w:pPr>
+              <w:keepNext/>
+              <w:rPr>
+                <w:sz w:val="19"/>
+                <w:szCs w:val="19"/>
+              </w:rPr>
+            </w:pPr>
+            <w:r>
+              <w:rPr>
+                <w:b/>
+                <w:color w:val="1F4E5A"/>
+                <w:sz w:val="19"/>
+                <w:szCs w:val="19"/>
+              </w:rPr>
+              <w:t>Tarea</w:t>
+            </w:r>
+          </w:p>
+        </w:tc>
+        <w:tc>
+          <w:tcPr>
+            <w:tcW w:w="2551" w:type="dxa"/>
+            <w:shd w:val="clear" w:color="auto" w:fill="DCE6E8"/>
+          </w:tcPr>
+          <w:p>
+            <w:pPr>
+              <w:keepNext/>
+              <w:rPr>
+                <w:sz w:val="19"/>
+                <w:szCs w:val="19"/>
+              </w:rPr>
+            </w:pPr>
+            <w:r>
+              <w:rPr>
+                <w:b/>
+                <w:color w:val="1F4E5A"/>
+                <w:sz w:val="19"/>
+                <w:szCs w:val="19"/>
+              </w:rPr>
+              <w:t>Responsable</w:t>
+            </w:r>
+          </w:p>
+        </w:tc>
+        <w:tc>
+          <w:tcPr>
+            <w:tcW w:w="2553" w:type="dxa"/>
+            <w:shd w:val="clear" w:color="auto" w:fill="DCE6E8"/>
+          </w:tcPr>
+          <w:p>
+            <w:pPr>
+              <w:keepNext/>
+              <w:rPr>
+                <w:sz w:val="19"/>
+                <w:szCs w:val="19"/>
+              </w:rPr>
+            </w:pPr>
+            <w:r>
+              <w:rPr>
+                <w:b/>
+                <w:color w:val="1F4E5A"/>
+                <w:sz w:val="19"/>
+                <w:szCs w:val="19"/>
+              </w:rPr>
+              <w:t>Fecha comprometida</w:t>
+            </w:r>
+          </w:p>
+        </w:tc>
+      </w:tr>
+      <w:tr>
+        <w:trPr>
+          <w:cantSplit/>
+          <w:trHeight w:val="340"/>
+        </w:trPr>
+        <w:tc>
+          <w:tcPr>
+            <w:tcW w:w="2607" w:type="dxa"/>
+            <w:vMerge/>
+          </w:tcPr>
+          <w:p>
+            <w:pPr>
+              <w:keepNext/>
+              <w:rPr>
+                <w:sz w:val="19"/>
+                <w:szCs w:val="19"/>
+              </w:rPr>
+            </w:pPr>
+          </w:p>
+        </w:tc>
+        <w:tc>
+          <w:tcPr>
+            <w:tcW w:w="6859" w:type="dxa"/>
+          </w:tcPr>
+          <w:p>
+            <w:pPr>
+              <w:keepNext/>
+              <w:rPr>
+                <w:sz w:val="19"/>
+                <w:szCs w:val="19"/>
+              </w:rPr>
+            </w:pPr>
+            <w:r>
+              <w:rPr>
+                <w:sz w:val="19"/>
+                <w:szCs w:val="19"/>
+              </w:rPr>
+              <w:t>Plan</w:t>
+            </w:r>
+            <w:r>
+              <w:rPr>
+                <w:sz w:val="19"/>
+                <w:szCs w:val="19"/>
+              </w:rPr>
+              <w:t xml:space="preserve"> </w:t>
+            </w:r>
+            <w:r>
+              <w:rPr>
+                <w:sz w:val="19"/>
+                <w:szCs w:val="19"/>
+              </w:rPr>
+              <w:t>de</w:t>
+            </w:r>
+            <w:r>
+              <w:rPr>
+                <w:sz w:val="19"/>
+                <w:szCs w:val="19"/>
+              </w:rPr>
+              <w:t xml:space="preserve"> gestión </w:t>
+            </w:r>
+            <w:r>
+              <w:rPr>
+                <w:sz w:val="19"/>
+                <w:szCs w:val="19"/>
+              </w:rPr>
+              <w:t>de</w:t>
+            </w:r>
+            <w:r>
+              <w:rPr>
+                <w:sz w:val="19"/>
+                <w:szCs w:val="19"/>
+              </w:rPr>
+              <w:t xml:space="preserve"> </w:t>
+            </w:r>
+            <w:r>
+              <w:rPr>
+                <w:sz w:val="19"/>
+                <w:szCs w:val="19"/>
+              </w:rPr>
+              <w:t>comunicaciones_v1.0</w:t>
+            </w:r>
+          </w:p>
+        </w:tc>
+        <w:tc>
+          <w:tcPr>
+            <w:tcW w:w="2551" w:type="dxa"/>
+          </w:tcPr>
+          <w:p>
+            <w:pPr>
+              <w:keepNext/>
+              <w:rPr>
+                <w:sz w:val="19"/>
+                <w:szCs w:val="19"/>
+              </w:rPr>
+            </w:pPr>
+            <w:r>
+              <w:rPr>
+                <w:sz w:val="19"/>
+                <w:szCs w:val="19"/>
+              </w:rPr>
+              <w:t>DSH</w:t>
+            </w:r>
+          </w:p>
+        </w:tc>
+        <w:tc>
+          <w:tcPr>
+            <w:tcW w:w="2553" w:type="dxa"/>
+          </w:tcPr>
+          <w:p>
+            <w:pPr>
+              <w:keepNext/>
+              <w:rPr>
+                <w:sz w:val="19"/>
+                <w:szCs w:val="19"/>
+              </w:rPr>
+            </w:pPr>
+            <w:r>
+              <w:rPr>
+                <w:sz w:val="19"/>
+                <w:szCs w:val="19"/>
+              </w:rPr>
+              <w:t>11</w:t>
+            </w:r>
+            <w:r>
+              <w:rPr>
+                <w:sz w:val="19"/>
+                <w:szCs w:val="19"/>
+              </w:rPr>
+              <w:t>/10/2026</w:t>
+            </w:r>
+          </w:p>
+        </w:tc>
+      </w:tr>
+      <w:tr>
+        <w:trPr>
+          <w:cantSplit/>
+          <w:trHeight w:val="340"/>
+        </w:trPr>
+        <w:tc>
+          <w:tcPr>
+            <w:tcW w:w="2607" w:type="dxa"/>
+            <w:vMerge/>
+          </w:tcPr>
+          <w:p>
+            <w:pPr>
+              <w:keepNext/>
+              <w:rPr>
+                <w:sz w:val="19"/>
+                <w:szCs w:val="19"/>
+              </w:rPr>
+            </w:pPr>
+          </w:p>
+        </w:tc>
+        <w:tc>
+          <w:tcPr>
+            <w:tcW w:w="6859" w:type="dxa"/>
+          </w:tcPr>
+          <w:p>
+            <w:pPr>
+              <w:keepNext/>
+              <w:rPr>
+                <w:sz w:val="19"/>
+                <w:szCs w:val="19"/>
+              </w:rPr>
+            </w:pPr>
+            <w:r>
+              <w:rPr>
+                <w:sz w:val="19"/>
+                <w:szCs w:val="19"/>
+              </w:rPr>
+              <w:t>Registro</w:t>
+            </w:r>
+            <w:r>
+              <w:rPr>
+                <w:sz w:val="19"/>
+                <w:szCs w:val="19"/>
+              </w:rPr>
+              <w:t xml:space="preserve"> </w:t>
+            </w:r>
+            <w:r>
+              <w:rPr>
+                <w:sz w:val="19"/>
+                <w:szCs w:val="19"/>
+              </w:rPr>
+              <w:t>de</w:t>
+            </w:r>
+            <w:r>
+              <w:rPr>
+                <w:sz w:val="19"/>
+                <w:szCs w:val="19"/>
+              </w:rPr>
+              <w:t xml:space="preserve"> </w:t>
+            </w:r>
+            <w:r>
+              <w:rPr>
+                <w:sz w:val="19"/>
+                <w:szCs w:val="19"/>
+              </w:rPr>
+              <w:t>supuestos</w:t>
+            </w:r>
+            <w:r>
+              <w:rPr>
+                <w:sz w:val="19"/>
+                <w:szCs w:val="19"/>
+              </w:rPr>
+              <w:t xml:space="preserve"> </w:t>
+            </w:r>
+            <w:r>
+              <w:rPr>
+                <w:sz w:val="19"/>
+                <w:szCs w:val="19"/>
+              </w:rPr>
+              <w:t>v1.1</w:t>
+            </w:r>
+          </w:p>
+        </w:tc>
+        <w:tc>
+          <w:tcPr>
+            <w:tcW w:w="2551" w:type="dxa"/>
+          </w:tcPr>
+          <w:p>
+            <w:pPr>
+              <w:keepNext/>
+              <w:rPr>
+                <w:sz w:val="19"/>
+                <w:szCs w:val="19"/>
+              </w:rPr>
+            </w:pPr>
+            <w:r>
+              <w:rPr>
+                <w:sz w:val="19"/>
+                <w:szCs w:val="19"/>
+              </w:rPr>
+              <w:t>CRMV</w:t>
+            </w:r>
+          </w:p>
+        </w:tc>
+        <w:tc>
+          <w:tcPr>
+            <w:tcW w:w="2553" w:type="dxa"/>
+          </w:tcPr>
+          <w:p>
+            <w:pPr>
+              <w:keepNext/>
+              <w:rPr>
+                <w:sz w:val="19"/>
+                <w:szCs w:val="19"/>
+              </w:rPr>
+            </w:pPr>
+            <w:r>
+              <w:rPr>
+                <w:sz w:val="19"/>
+                <w:szCs w:val="19"/>
+              </w:rPr>
+              <w:t>11</w:t>
+            </w:r>
+            <w:r>
+              <w:rPr>
+                <w:sz w:val="19"/>
+                <w:szCs w:val="19"/>
+              </w:rPr>
+              <w:t>/10/2026</w:t>
+            </w:r>
+          </w:p>
+        </w:tc>
+      </w:tr>
+      <w:tr>
+        <w:trPr>
+          <w:cantSplit/>
+          <w:trHeight w:val="340"/>
+        </w:trPr>
+        <w:tc>
+          <w:tcPr>
+            <w:tcW w:w="2607" w:type="dxa"/>
+            <w:vMerge/>
+          </w:tcPr>
+          <w:p>
+            <w:pPr>
+              <w:keepNext/>
+              <w:rPr>
+                <w:sz w:val="19"/>
+                <w:szCs w:val="19"/>
+              </w:rPr>
+            </w:pPr>
+          </w:p>
+        </w:tc>
+        <w:tc>
+          <w:tcPr>
+            <w:tcW w:w="6859" w:type="dxa"/>
+          </w:tcPr>
+          <w:p>
+            <w:pPr>
+              <w:keepNext/>
+              <w:rPr>
+                <w:sz w:val="19"/>
+                <w:szCs w:val="19"/>
+              </w:rPr>
+            </w:pPr>
+            <w:r>
+              <w:rPr>
+                <w:sz w:val="19"/>
+                <w:szCs w:val="19"/>
+              </w:rPr>
+              <w:t>Registro de requisitos v1.1</w:t>
+            </w:r>
+          </w:p>
+        </w:tc>
+        <w:tc>
+          <w:tcPr>
+            <w:tcW w:w="2551" w:type="dxa"/>
+          </w:tcPr>
+          <w:p>
+            <w:pPr>
+              <w:keepNext/>
+              <w:rPr>
+                <w:sz w:val="19"/>
+                <w:szCs w:val="19"/>
+              </w:rPr>
+            </w:pPr>
+            <w:r>
+              <w:rPr>
+                <w:sz w:val="19"/>
+                <w:szCs w:val="19"/>
+              </w:rPr>
+              <w:t>DSH</w:t>
+            </w:r>
+          </w:p>
+        </w:tc>
+        <w:tc>
+          <w:tcPr>
+            <w:tcW w:w="2553" w:type="dxa"/>
+          </w:tcPr>
+          <w:p>
+            <w:pPr>
+              <w:keepNext/>
+              <w:rPr>
+                <w:sz w:val="19"/>
+                <w:szCs w:val="19"/>
+              </w:rPr>
+            </w:pPr>
+            <w:r>
+              <w:rPr>
+                <w:sz w:val="19"/>
+                <w:szCs w:val="19"/>
+              </w:rPr>
+              <w:t>11/10/2026</w:t>
+            </w:r>
           </w:p>
         </w:tc>
       </w:tr>
@@ -5347,7 +6454,39 @@
                 <w:sz w:val="18"/>
                 <w:szCs w:val="18"/>
               </w:rPr>
-              <w:t>“Vigente” o, si se revoca, “Revocada por D-07 el dd/mm/aaaa”. La decisión revocada no se borra ni se reescribe. Una estimación que resultó mala se corrige del mismo modo, con una decisión nueva.</w:t>
+              <w:t xml:space="preserve">“Vigente” o, si se revoca, “Revocada por D-07 el </w:t>
+            </w:r>
+            <w:proofErr w:type="spellStart"/>
+            <w:r>
+              <w:rPr>
+                <w:sz w:val="18"/>
+                <w:szCs w:val="18"/>
+              </w:rPr>
+              <w:t>dd</w:t>
+            </w:r>
+            <w:proofErr w:type="spellEnd"/>
+            <w:r>
+              <w:rPr>
+                <w:sz w:val="18"/>
+                <w:szCs w:val="18"/>
+              </w:rPr>
+              <w:t>/mm/</w:t>
+            </w:r>
+            <w:proofErr w:type="spellStart"/>
+            <w:r>
+              <w:rPr>
+                <w:sz w:val="18"/>
+                <w:szCs w:val="18"/>
+              </w:rPr>
+              <w:t>aaaa</w:t>
+            </w:r>
+            <w:proofErr w:type="spellEnd"/>
+            <w:r>
+              <w:rPr>
+                <w:sz w:val="18"/>
+                <w:szCs w:val="18"/>
+              </w:rPr>
+              <w:t>”. La decisión revocada no se borra ni se reescribe. Una estimación que resultó mala se corrige del mismo modo, con una decisión nueva.</w:t>
             </w:r>
           </w:p>
         </w:tc>
@@ -5829,7 +6968,23 @@
                 <w:sz w:val="17"/>
                 <w:szCs w:val="17"/>
               </w:rPr>
-              <w:t>NOR-05 pide un informe por sprint, sin excepción. Se revisará cuando el cronograma fije los sprints (Práctica 04).</w:t>
+              <w:t xml:space="preserve">NOR-05 pide un informe por sprint, sin excepción. Se revisará cuando el cronograma fije los </w:t>
+            </w:r>
+            <w:proofErr w:type="spellStart"/>
+            <w:r>
+              <w:rPr>
+                <w:sz w:val="17"/>
+                <w:szCs w:val="17"/>
+              </w:rPr>
+              <w:t>sprints</w:t>
+            </w:r>
+            <w:proofErr w:type="spellEnd"/>
+            <w:r>
+              <w:rPr>
+                <w:sz w:val="17"/>
+                <w:szCs w:val="17"/>
+              </w:rPr>
+              <w:t xml:space="preserve"> (Práctica 04).</w:t>
             </w:r>
           </w:p>
         </w:tc>
@@ -6868,6 +8023,13 @@
                 <w:szCs w:val="19"/>
               </w:rPr>
             </w:pPr>
+            <w:r>
+              <w:rPr>
+                <w:sz w:val="19"/>
+                <w:szCs w:val="19"/>
+              </w:rPr>
+              <w:t>01</w:t>
+            </w:r>
           </w:p>
         </w:tc>
         <w:tc>
@@ -6881,6 +8043,13 @@
                 <w:szCs w:val="19"/>
               </w:rPr>
             </w:pPr>
+            <w:r>
+              <w:rPr>
+                <w:sz w:val="19"/>
+                <w:szCs w:val="19"/>
+              </w:rPr>
+              <w:t>13/10/2026</w:t>
+            </w:r>
           </w:p>
         </w:tc>
         <w:tc>
@@ -6894,6 +8063,22 @@
                 <w:szCs w:val="19"/>
               </w:rPr>
             </w:pPr>
+            <w:r>
+              <w:rPr>
+                <w:sz w:val="19"/>
+                <w:szCs w:val="19"/>
+              </w:rPr>
+              <w:t xml:space="preserve">Calendario de cierres comerciales de </w:t>
+            </w:r>
+            <w:proofErr w:type="spellStart"/>
+            <w:r>
+              <w:rPr>
+                <w:sz w:val="19"/>
+                <w:szCs w:val="19"/>
+              </w:rPr>
+              <w:t>TuSuper</w:t>
+            </w:r>
+            <w:proofErr w:type="spellEnd"/>
           </w:p>
         </w:tc>
         <w:tc>
@@ -6907,6 +8092,27 @@
                 <w:szCs w:val="19"/>
               </w:rPr>
             </w:pPr>
+            <w:r>
+              <w:rPr>
+                <w:sz w:val="19"/>
+                <w:szCs w:val="19"/>
+              </w:rPr>
+              <w:t>S-11</w:t>
+            </w:r>
+            <w:r>
+              <w:rPr>
+                <w:sz w:val="19"/>
+                <w:szCs w:val="19"/>
+              </w:rPr>
+              <w:t>, Re</w:t>
+            </w:r>
+            <w:r>
+              <w:rPr>
+                <w:sz w:val="19"/>
+                <w:szCs w:val="19"/>
+              </w:rPr>
+              <w:t>gistro de Supuestos v1.1</w:t>
+            </w:r>
           </w:p>
         </w:tc>
         <w:tc>
@@ -6920,6 +8126,13 @@
                 <w:szCs w:val="19"/>
               </w:rPr>
             </w:pPr>
+            <w:r>
+              <w:rPr>
+                <w:sz w:val="19"/>
+                <w:szCs w:val="19"/>
+              </w:rPr>
+              <w:t>Pendiente de respuesta</w:t>
+            </w:r>
           </w:p>
         </w:tc>
         <w:tc>
@@ -6933,6 +8146,13 @@
                 <w:szCs w:val="19"/>
               </w:rPr>
             </w:pPr>
+            <w:r>
+              <w:rPr>
+                <w:sz w:val="19"/>
+                <w:szCs w:val="19"/>
+              </w:rPr>
+              <w:t>No aplica aún</w:t>
+            </w:r>
           </w:p>
         </w:tc>
       </w:tr>
@@ -10146,7 +11366,6 @@
   <w:style w:type="character" w:default="1" w:styleId="Fuentedeprrafopredeter">
     <w:name w:val="Default Paragraph Font"/>
     <w:uiPriority w:val="1"/>
-    <w:semiHidden/>
     <w:unhideWhenUsed/>
   </w:style>
   <w:style w:type="table" w:default="1" w:styleId="Tablanormal">
@@ -10285,6 +11504,29 @@
     <w:pPr>
       <w:spacing w:after="0" w:line="240" w:lineRule="auto"/>
     </w:pPr>
+  </w:style>
+  <w:style w:type="character" w:styleId="Hipervnculo">
+    <w:name w:val="Hyperlink"/>
+    <w:basedOn w:val="Fuentedeprrafopredeter"/>
+    <w:uiPriority w:val="99"/>
+    <w:unhideWhenUsed/>
+    <w:rsid w:val="00501D6E"/>
+    <w:rPr>
+      <w:color w:val="0000FF" w:themeColor="hyperlink"/>
+      <w:u w:val="single"/>
+    </w:rPr>
+  </w:style>
+  <w:style w:type="character" w:styleId="Mencinsinresolver">
+    <w:name w:val="Unresolved Mention"/>
+    <w:basedOn w:val="Fuentedeprrafopredeter"/>
+    <w:uiPriority w:val="99"/>
+    <w:semiHidden/>
+    <w:unhideWhenUsed/>
+    <w:rsid w:val="00501D6E"/>
+    <w:rPr>
+      <w:color w:val="605E5C"/>
+      <w:shd w:val="clear" w:color="auto" w:fill="E1DFDD"/>
+    </w:rPr>
   </w:style>
 </w:styles>
 </file>

</xml_diff>